<commit_message>
docs: enrich Quarter 4 NPC dialogue scripts for all 6 aquatic guardians, Maps 10-12, and Lotus Raft in PDF/DOCX/MD
</commit_message>
<xml_diff>
--- a/docs/Cognitive_Quest_NPC_Scripts_Master.docx
+++ b/docs/Cognitive_Quest_NPC_Scripts_Master.docx
@@ -6087,7 +6087,7 @@
           <w:color w:val="0F766E"/>
           <w:sz w:val="27"/>
         </w:rPr>
-        <w:t>🗺️ Maps 10, 11, &amp; 12: "The Temple Aqueduct, Lotus Raft, &amp; Final Sanctum"</w:t>
+        <w:t>🗺️ Map 10: "The Submerged Aqueduct &amp; Fountain Halls"</w:t>
       </w:r>
     </w:p>
     <w:p>
@@ -6102,7 +6102,7 @@
           <w:color w:val="4338CA"/>
           <w:sz w:val="23"/>
         </w:rPr>
-        <w:t>📋 Quarter 4 Instructions Popup</w:t>
+        <w:t>📋 Map 10 Instructions Popup</w:t>
       </w:r>
     </w:p>
     <w:tbl>
@@ -6139,7 +6139,7 @@
                 <w:color w:val="1E293B"/>
                 <w:sz w:val="18"/>
               </w:rPr>
-              <w:t>║                     THE WATER TEMPLE SANCTUARY                       ║</w:t>
+              <w:t>║                   THE SUBMERGED AQUEDUCT CHALLENGE                   ║</w:t>
               <w:br/>
             </w:r>
             <w:r>
@@ -6157,7 +6157,7 @@
                 <w:color w:val="1E293B"/>
                 <w:sz w:val="18"/>
               </w:rPr>
-              <w:t>║ Dive deep into the sunken sanctum, [Player Name]!                    ║</w:t>
+              <w:t>║ Welcome to the Water Temple, [Player Name]!                          ║</w:t>
               <w:br/>
             </w:r>
             <w:r>
@@ -6175,25 +6175,25 @@
                 <w:color w:val="1E293B"/>
                 <w:sz w:val="18"/>
               </w:rPr>
-              <w:t>║ 1. Locate the 5 Water Temple Guardians:                              ║</w:t>
-              <w:br/>
-            </w:r>
-            <w:r>
-              <w:rPr>
-                <w:rFonts w:ascii="Consolas" w:hAnsi="Consolas"/>
-                <w:color w:val="1E293B"/>
-                <w:sz w:val="18"/>
-              </w:rPr>
-              <w:t>║    • Find each guardian stationed along the submerged aqueducts.     ║</w:t>
-              <w:br/>
-            </w:r>
-            <w:r>
-              <w:rPr>
-                <w:rFonts w:ascii="Consolas" w:hAnsi="Consolas"/>
-                <w:color w:val="1E293B"/>
-                <w:sz w:val="18"/>
-              </w:rPr>
-              <w:t>║    • Hold a CLOSED FIST to solve advanced grade-level challenges.    ║</w:t>
+              <w:t>║ 1. Meet the 6 Elemental Water Guardians:                             ║</w:t>
+              <w:br/>
+            </w:r>
+            <w:r>
+              <w:rPr>
+                <w:rFonts w:ascii="Consolas" w:hAnsi="Consolas"/>
+                <w:color w:val="1E293B"/>
+                <w:sz w:val="18"/>
+              </w:rPr>
+              <w:t>║    • Explore the flooded stone corridors and fountain basins.        ║</w:t>
+              <w:br/>
+            </w:r>
+            <w:r>
+              <w:rPr>
+                <w:rFonts w:ascii="Consolas" w:hAnsi="Consolas"/>
+                <w:color w:val="1E293B"/>
+                <w:sz w:val="18"/>
+              </w:rPr>
+              <w:t>║    • Approach each guardian and HOLD FIST to view their challenge.   ║</w:t>
               <w:br/>
             </w:r>
             <w:r>
@@ -6211,16 +6211,25 @@
                 <w:color w:val="1E293B"/>
                 <w:sz w:val="18"/>
               </w:rPr>
-              <w:t>║ 2. Collect 5 Golden Keys:                                            ║</w:t>
-              <w:br/>
-            </w:r>
-            <w:r>
-              <w:rPr>
-                <w:rFonts w:ascii="Consolas" w:hAnsi="Consolas"/>
-                <w:color w:val="1E293B"/>
-                <w:sz w:val="18"/>
-              </w:rPr>
-              <w:t>║    • Watch each key fly into your Objectives HUD upon success!       ║</w:t>
+              <w:t>║ 2. Collect 6 Golden Keys:                                            ║</w:t>
+              <w:br/>
+            </w:r>
+            <w:r>
+              <w:rPr>
+                <w:rFonts w:ascii="Consolas" w:hAnsi="Consolas"/>
+                <w:color w:val="1E293B"/>
+                <w:sz w:val="18"/>
+              </w:rPr>
+              <w:t>║    • Each correct answer awards 1 gleaming Golden Key that flies     ║</w:t>
+              <w:br/>
+            </w:r>
+            <w:r>
+              <w:rPr>
+                <w:rFonts w:ascii="Consolas" w:hAnsi="Consolas"/>
+                <w:color w:val="1E293B"/>
+                <w:sz w:val="18"/>
+              </w:rPr>
+              <w:t>║      directly into your Objectives HUD!                              ║</w:t>
               <w:br/>
             </w:r>
             <w:r>
@@ -6238,16 +6247,25 @@
                 <w:color w:val="1E293B"/>
                 <w:sz w:val="18"/>
               </w:rPr>
-              <w:t>║ 3. Activate the Lotus Raft &amp; Floodgate Controls:                     ║</w:t>
-              <w:br/>
-            </w:r>
-            <w:r>
-              <w:rPr>
-                <w:rFonts w:ascii="Consolas" w:hAnsi="Consolas"/>
-                <w:color w:val="1E293B"/>
-                <w:sz w:val="18"/>
-              </w:rPr>
-              <w:t>║    • Unlock the Master Temple Sanctum to complete Cognitive Quest!   ║</w:t>
+              <w:t>║ 3. Unlock the Aqueduct Gateway:                                      ║</w:t>
+              <w:br/>
+            </w:r>
+            <w:r>
+              <w:rPr>
+                <w:rFonts w:ascii="Consolas" w:hAnsi="Consolas"/>
+                <w:color w:val="1E293B"/>
+                <w:sz w:val="18"/>
+              </w:rPr>
+              <w:t>║    • Once all 6 Golden Keys are collected, the water gates lower     ║</w:t>
+              <w:br/>
+            </w:r>
+            <w:r>
+              <w:rPr>
+                <w:rFonts w:ascii="Consolas" w:hAnsi="Consolas"/>
+                <w:color w:val="1E293B"/>
+                <w:sz w:val="18"/>
+              </w:rPr>
+              <w:t>║      and the passage to the Sunken Vault opens!                      ║</w:t>
               <w:br/>
             </w:r>
             <w:r>
@@ -6264,6 +6282,26 @@
       </w:tr>
     </w:tbl>
     <w:p/>
+    <w:p>
+      <w:pPr>
+        <w:spacing w:before="120" w:after="120"/>
+      </w:pPr>
+    </w:p>
+    <w:p>
+      <w:pPr>
+        <w:pStyle w:val="Heading2"/>
+        <w:spacing w:before="200" w:after="60"/>
+      </w:pPr>
+      <w:r>
+        <w:rPr>
+          <w:rFonts w:ascii="Calibri" w:hAnsi="Calibri"/>
+          <w:b/>
+          <w:color w:val="0F766E"/>
+          <w:sz w:val="27"/>
+        </w:rPr>
+        <w:t>🗺️ Map 11: "The Sunken Vault &amp; The Ancient Key Lock"</w:t>
+      </w:r>
+    </w:p>
     <w:p>
       <w:pPr>
         <w:pStyle w:val="Heading3"/>
@@ -6276,7 +6314,7 @@
           <w:color w:val="4338CA"/>
           <w:sz w:val="23"/>
         </w:rPr>
-        <w:t>💬 Stations 1–5: Water Temple Guardians</w:t>
+        <w:t>📋 Map 11 Instructions Popup</w:t>
       </w:r>
     </w:p>
     <w:tbl>
@@ -6301,177 +6339,91 @@
             <w:r>
               <w:rPr>
                 <w:rFonts w:ascii="Consolas" w:hAnsi="Consolas"/>
-                <w:b/>
-                <w:color w:val="0E7490"/>
-                <w:sz w:val="18"/>
-              </w:rPr>
-              <w:t>[Proximity Trigger]:</w:t>
-              <w:br/>
-            </w:r>
-            <w:r>
-              <w:rPr>
-                <w:rFonts w:ascii="Consolas" w:hAnsi="Consolas"/>
-                <w:b/>
-                <w:color w:val="B45309"/>
-                <w:sz w:val="18"/>
-              </w:rPr>
-              <w:t>Water Guardian:</w:t>
-              <w:br/>
-            </w:r>
-            <w:r>
-              <w:rPr>
-                <w:rFonts w:ascii="Consolas" w:hAnsi="Consolas"/>
-                <w:color w:val="1E293B"/>
-                <w:sz w:val="18"/>
-              </w:rPr>
-              <w:t>“Greetings, seeker of the deep! The clear waters flow according to perfect mathematical harmony. Hold a Closed Fist to channel your logical power!”</w:t>
-              <w:br/>
-            </w:r>
-            <w:r>
-              <w:rPr>
-                <w:rFonts w:ascii="Consolas" w:hAnsi="Consolas"/>
-                <w:color w:val="1E293B"/>
-                <w:sz w:val="18"/>
-              </w:rPr>
-              <w:br/>
-            </w:r>
-            <w:r>
-              <w:rPr>
-                <w:rFonts w:ascii="Consolas" w:hAnsi="Consolas"/>
-                <w:b/>
-                <w:color w:val="0E7490"/>
-                <w:sz w:val="18"/>
-              </w:rPr>
-              <w:t>[Gesture: Fist Closed]:</w:t>
-              <w:br/>
-            </w:r>
-            <w:r>
-              <w:rPr>
-                <w:rFonts w:ascii="Consolas" w:hAnsi="Consolas"/>
-                <w:color w:val="1E293B"/>
-                <w:sz w:val="18"/>
-              </w:rPr>
-              <w:t>→ Pop up Dynamic Question from Database</w:t>
-              <w:br/>
-            </w:r>
-            <w:r>
-              <w:rPr>
-                <w:rFonts w:ascii="Consolas" w:hAnsi="Consolas"/>
-                <w:color w:val="1E293B"/>
-                <w:sz w:val="18"/>
-              </w:rPr>
-              <w:br/>
-            </w:r>
-            <w:r>
-              <w:rPr>
-                <w:rFonts w:ascii="Consolas" w:hAnsi="Consolas"/>
-                <w:b/>
-                <w:color w:val="0E7490"/>
-                <w:sz w:val="18"/>
-              </w:rPr>
-              <w:t>[Feedback - Wrong / Retry]:</w:t>
-              <w:br/>
-            </w:r>
-            <w:r>
-              <w:rPr>
-                <w:rFonts w:ascii="Consolas" w:hAnsi="Consolas"/>
-                <w:b/>
-                <w:color w:val="B45309"/>
-                <w:sz w:val="18"/>
-              </w:rPr>
-              <w:t>Water Guardian:</w:t>
-              <w:br/>
-            </w:r>
-            <w:r>
-              <w:rPr>
-                <w:rFonts w:ascii="Consolas" w:hAnsi="Consolas"/>
-                <w:color w:val="1E293B"/>
-                <w:sz w:val="18"/>
-              </w:rPr>
-              <w:t>“Think carefully! Try again.”</w:t>
-              <w:br/>
-            </w:r>
-            <w:r>
-              <w:rPr>
-                <w:rFonts w:ascii="Consolas" w:hAnsi="Consolas"/>
-                <w:color w:val="1E293B"/>
-                <w:sz w:val="18"/>
-              </w:rPr>
-              <w:br/>
-            </w:r>
-            <w:r>
-              <w:rPr>
-                <w:rFonts w:ascii="Consolas" w:hAnsi="Consolas"/>
-                <w:b/>
-                <w:color w:val="0E7490"/>
-                <w:sz w:val="18"/>
-              </w:rPr>
-              <w:t>[Feedback - Out of Tries]:</w:t>
-              <w:br/>
-            </w:r>
-            <w:r>
-              <w:rPr>
-                <w:rFonts w:ascii="Consolas" w:hAnsi="Consolas"/>
-                <w:b/>
-                <w:color w:val="B45309"/>
-                <w:sz w:val="18"/>
-              </w:rPr>
-              <w:t>Water Guardian:</w:t>
-              <w:br/>
-            </w:r>
-            <w:r>
-              <w:rPr>
-                <w:rFonts w:ascii="Consolas" w:hAnsi="Consolas"/>
-                <w:color w:val="1E293B"/>
-                <w:sz w:val="18"/>
-              </w:rPr>
-              <w:t>“The ocean rewards perseverance. Here is your Golden Key so your quest can proceed!”</w:t>
-              <w:br/>
-            </w:r>
-            <w:r>
-              <w:rPr>
-                <w:rFonts w:ascii="Consolas" w:hAnsi="Consolas"/>
-                <w:color w:val="1E293B"/>
-                <w:sz w:val="18"/>
-              </w:rPr>
-              <w:br/>
-            </w:r>
-            <w:r>
-              <w:rPr>
-                <w:rFonts w:ascii="Consolas" w:hAnsi="Consolas"/>
-                <w:b/>
-                <w:color w:val="0E7490"/>
-                <w:sz w:val="18"/>
-              </w:rPr>
-              <w:t>[Feedback - Correct]:</w:t>
-              <w:br/>
-            </w:r>
-            <w:r>
-              <w:rPr>
-                <w:rFonts w:ascii="Consolas" w:hAnsi="Consolas"/>
-                <w:b/>
-                <w:color w:val="B45309"/>
-                <w:sz w:val="18"/>
-              </w:rPr>
-              <w:t>Water Guardian:</w:t>
-              <w:br/>
-            </w:r>
-            <w:r>
-              <w:rPr>
-                <w:rFonts w:ascii="Consolas" w:hAnsi="Consolas"/>
-                <w:color w:val="1E293B"/>
-                <w:sz w:val="18"/>
-              </w:rPr>
-              <w:t>“Splendid! The waters shine bright! A Golden Key flies into your Objectives HUD!”</w:t>
-              <w:br/>
-            </w:r>
-            <w:r>
-              <w:rPr>
-                <w:rFonts w:ascii="Consolas" w:hAnsi="Consolas"/>
-                <w:color w:val="1E293B"/>
-                <w:sz w:val="18"/>
-              </w:rPr>
-              <w:t>*(Golden Key award animation flies smoothly down to the Objectives HUD!)*</w:t>
+                <w:color w:val="1E293B"/>
+                <w:sz w:val="18"/>
+              </w:rPr>
+              <w:t>╔══════════════════════════════════════════════════════════════════════╗</w:t>
+              <w:br/>
+            </w:r>
+            <w:r>
+              <w:rPr>
+                <w:rFonts w:ascii="Consolas" w:hAnsi="Consolas"/>
+                <w:color w:val="1E293B"/>
+                <w:sz w:val="18"/>
+              </w:rPr>
+              <w:t>║                     THE ANCIENT KEY LOCK VAULT                       ║</w:t>
+              <w:br/>
+            </w:r>
+            <w:r>
+              <w:rPr>
+                <w:rFonts w:ascii="Consolas" w:hAnsi="Consolas"/>
+                <w:color w:val="1E293B"/>
+                <w:sz w:val="18"/>
+              </w:rPr>
+              <w:t>╠══════════════════════════════════════════════════════════════════════╣</w:t>
+              <w:br/>
+            </w:r>
+            <w:r>
+              <w:rPr>
+                <w:rFonts w:ascii="Consolas" w:hAnsi="Consolas"/>
+                <w:color w:val="1E293B"/>
+                <w:sz w:val="18"/>
+              </w:rPr>
+              <w:t>║ Deep within the flooded sanctuary, [Player Name]!                    ║</w:t>
+              <w:br/>
+            </w:r>
+            <w:r>
+              <w:rPr>
+                <w:rFonts w:ascii="Consolas" w:hAnsi="Consolas"/>
+                <w:color w:val="1E293B"/>
+                <w:sz w:val="18"/>
+              </w:rPr>
+              <w:t>║                                                                      ║</w:t>
+              <w:br/>
+            </w:r>
+            <w:r>
+              <w:rPr>
+                <w:rFonts w:ascii="Consolas" w:hAnsi="Consolas"/>
+                <w:color w:val="1E293B"/>
+                <w:sz w:val="18"/>
+              </w:rPr>
+              <w:t>║ 1. Gather all 6 Golden Keys from the 6 Water Guardians.             ║</w:t>
+              <w:br/>
+            </w:r>
+            <w:r>
+              <w:rPr>
+                <w:rFonts w:ascii="Consolas" w:hAnsi="Consolas"/>
+                <w:color w:val="1E293B"/>
+                <w:sz w:val="18"/>
+              </w:rPr>
+              <w:t>║ 2. Approach Guardian Bromen at the Ancient Lock Block.               ║</w:t>
+              <w:br/>
+            </w:r>
+            <w:r>
+              <w:rPr>
+                <w:rFonts w:ascii="Consolas" w:hAnsi="Consolas"/>
+                <w:color w:val="1E293B"/>
+                <w:sz w:val="18"/>
+              </w:rPr>
+              <w:t>║ 3. Drag &amp; turn each Golden Key into its corresponding keyhole.       ║</w:t>
+              <w:br/>
+            </w:r>
+            <w:r>
+              <w:rPr>
+                <w:rFonts w:ascii="Consolas" w:hAnsi="Consolas"/>
+                <w:color w:val="1E293B"/>
+                <w:sz w:val="18"/>
+              </w:rPr>
+              <w:t>║ 4. Watch the heavy dungeon double doors swing open and enter!        ║</w:t>
+              <w:br/>
+            </w:r>
+            <w:r>
+              <w:rPr>
+                <w:rFonts w:ascii="Consolas" w:hAnsi="Consolas"/>
+                <w:color w:val="1E293B"/>
+                <w:sz w:val="18"/>
+              </w:rPr>
+              <w:t>╚══════════════════════════════════════════════════════════════════════╝</w:t>
               <w:br/>
             </w:r>
           </w:p>
@@ -6479,6 +6431,26 @@
       </w:tr>
     </w:tbl>
     <w:p/>
+    <w:p>
+      <w:pPr>
+        <w:spacing w:before="120" w:after="120"/>
+      </w:pPr>
+    </w:p>
+    <w:p>
+      <w:pPr>
+        <w:pStyle w:val="Heading2"/>
+        <w:spacing w:before="200" w:after="60"/>
+      </w:pPr>
+      <w:r>
+        <w:rPr>
+          <w:rFonts w:ascii="Calibri" w:hAnsi="Calibri"/>
+          <w:b/>
+          <w:color w:val="0F766E"/>
+          <w:sz w:val="27"/>
+        </w:rPr>
+        <w:t>🗺️ Map 12: "The Grand Canal Rapids &amp; The Lotus Raft"</w:t>
+      </w:r>
+    </w:p>
     <w:p>
       <w:pPr>
         <w:pStyle w:val="Heading3"/>
@@ -6491,7 +6463,7 @@
           <w:color w:val="4338CA"/>
           <w:sz w:val="23"/>
         </w:rPr>
-        <w:t>🔱 Temple Elder (Master Floodgate Altar)</w:t>
+        <w:t>📋 Map 12 Instructions Popup</w:t>
       </w:r>
     </w:p>
     <w:tbl>
@@ -6519,87 +6491,1872 @@
                 <w:color w:val="1E293B"/>
                 <w:sz w:val="18"/>
               </w:rPr>
-              <w:t>[If Keys &lt; 5]:</w:t>
-              <w:br/>
-            </w:r>
-            <w:r>
-              <w:rPr>
-                <w:rFonts w:ascii="Consolas" w:hAnsi="Consolas"/>
-                <w:color w:val="1E293B"/>
-                <w:sz w:val="18"/>
-              </w:rPr>
-              <w:t>Temple Elder:</w:t>
-              <w:br/>
-            </w:r>
-            <w:r>
-              <w:rPr>
-                <w:rFonts w:ascii="Consolas" w:hAnsi="Consolas"/>
-                <w:color w:val="1E293B"/>
-                <w:sz w:val="18"/>
-              </w:rPr>
-              <w:t>“Halt, brave diver! The master floodgate remains sealed.</w:t>
-              <w:br/>
-            </w:r>
-            <w:r>
-              <w:rPr>
-                <w:rFonts w:ascii="Consolas" w:hAnsi="Consolas"/>
-                <w:color w:val="1E293B"/>
-                <w:sz w:val="18"/>
-              </w:rPr>
-              <w:t>Collect all 5 Golden Keys from the Water Guardians to calm the currents!”</w:t>
-              <w:br/>
-            </w:r>
-            <w:r>
-              <w:rPr>
-                <w:rFonts w:ascii="Consolas" w:hAnsi="Consolas"/>
-                <w:color w:val="1E293B"/>
-                <w:sz w:val="18"/>
-              </w:rPr>
-              <w:br/>
-            </w:r>
-            <w:r>
-              <w:rPr>
-                <w:rFonts w:ascii="Consolas" w:hAnsi="Consolas"/>
-                <w:color w:val="1E293B"/>
-                <w:sz w:val="18"/>
-              </w:rPr>
-              <w:t>[If Keys == 5]:</w:t>
-              <w:br/>
-            </w:r>
-            <w:r>
-              <w:rPr>
-                <w:rFonts w:ascii="Consolas" w:hAnsi="Consolas"/>
-                <w:color w:val="1E293B"/>
-                <w:sz w:val="18"/>
-              </w:rPr>
-              <w:t>Temple Elder:</w:t>
-              <w:br/>
-            </w:r>
-            <w:r>
-              <w:rPr>
-                <w:rFonts w:ascii="Consolas" w:hAnsi="Consolas"/>
-                <w:color w:val="1E293B"/>
-                <w:sz w:val="18"/>
-              </w:rPr>
-              <w:t>“Incredible, [Player Name]! All 5 Golden Keys are in place!</w:t>
-              <w:br/>
-            </w:r>
-            <w:r>
-              <w:rPr>
-                <w:rFonts w:ascii="Consolas" w:hAnsi="Consolas"/>
-                <w:color w:val="1E293B"/>
-                <w:sz w:val="18"/>
-              </w:rPr>
-              <w:t>The aqueducts align, the lotus raft glides forward, and the grand sanctuary is unlocked!</w:t>
-              <w:br/>
-            </w:r>
-            <w:r>
-              <w:rPr>
-                <w:rFonts w:ascii="Consolas" w:hAnsi="Consolas"/>
-                <w:color w:val="1E293B"/>
-                <w:sz w:val="18"/>
-              </w:rPr>
-              <w:t>You have mastered mathematics from the tallest forest trees to the deepest ocean temples!”</w:t>
+              <w:t>╔══════════════════════════════════════════════════════════════════════╗</w:t>
+              <w:br/>
+            </w:r>
+            <w:r>
+              <w:rPr>
+                <w:rFonts w:ascii="Consolas" w:hAnsi="Consolas"/>
+                <w:color w:val="1E293B"/>
+                <w:sz w:val="18"/>
+              </w:rPr>
+              <w:t>║                  THE LOTUS RAFT &amp; RAPIDS CRUISE                      ║</w:t>
+              <w:br/>
+            </w:r>
+            <w:r>
+              <w:rPr>
+                <w:rFonts w:ascii="Consolas" w:hAnsi="Consolas"/>
+                <w:color w:val="1E293B"/>
+                <w:sz w:val="18"/>
+              </w:rPr>
+              <w:t>╠══════════════════════════════════════════════════════════════════════╣</w:t>
+              <w:br/>
+            </w:r>
+            <w:r>
+              <w:rPr>
+                <w:rFonts w:ascii="Consolas" w:hAnsi="Consolas"/>
+                <w:color w:val="1E293B"/>
+                <w:sz w:val="18"/>
+              </w:rPr>
+              <w:t>║ The final challenge of Cognitive Quest awaits, [Player Name]!        ║</w:t>
+              <w:br/>
+            </w:r>
+            <w:r>
+              <w:rPr>
+                <w:rFonts w:ascii="Consolas" w:hAnsi="Consolas"/>
+                <w:color w:val="1E293B"/>
+                <w:sz w:val="18"/>
+              </w:rPr>
+              <w:t>║                                                                      ║</w:t>
+              <w:br/>
+            </w:r>
+            <w:r>
+              <w:rPr>
+                <w:rFonts w:ascii="Consolas" w:hAnsi="Consolas"/>
+                <w:color w:val="1E293B"/>
+                <w:sz w:val="18"/>
+              </w:rPr>
+              <w:t>║ 1. Open the 6 Canal Water Sluices:                                   ║</w:t>
+              <w:br/>
+            </w:r>
+            <w:r>
+              <w:rPr>
+                <w:rFonts w:ascii="Consolas" w:hAnsi="Consolas"/>
+                <w:color w:val="1E293B"/>
+                <w:sz w:val="18"/>
+              </w:rPr>
+              <w:t>║    • Solve math challenges with the 6 Temple Guardians to fill       ║</w:t>
+              <w:br/>
+            </w:r>
+            <w:r>
+              <w:rPr>
+                <w:rFonts w:ascii="Consolas" w:hAnsi="Consolas"/>
+                <w:color w:val="1E293B"/>
+                <w:sz w:val="18"/>
+              </w:rPr>
+              <w:t>║      the dry canal basin with rushing crystal water!                 ║</w:t>
+              <w:br/>
+            </w:r>
+            <w:r>
+              <w:rPr>
+                <w:rFonts w:ascii="Consolas" w:hAnsi="Consolas"/>
+                <w:color w:val="1E293B"/>
+                <w:sz w:val="18"/>
+              </w:rPr>
+              <w:t>║                                                                      ║</w:t>
+              <w:br/>
+            </w:r>
+            <w:r>
+              <w:rPr>
+                <w:rFonts w:ascii="Consolas" w:hAnsi="Consolas"/>
+                <w:color w:val="1E293B"/>
+                <w:sz w:val="18"/>
+              </w:rPr>
+              <w:t>║ 2. Restore the Helm Equation with Guardian Bromen:                   ║</w:t>
+              <w:br/>
+            </w:r>
+            <w:r>
+              <w:rPr>
+                <w:rFonts w:ascii="Consolas" w:hAnsi="Consolas"/>
+                <w:color w:val="1E293B"/>
+                <w:sz w:val="18"/>
+              </w:rPr>
+              <w:t>║    • Arrange scattered stone runes into a balanced addition equation ║</w:t>
+              <w:br/>
+            </w:r>
+            <w:r>
+              <w:rPr>
+                <w:rFonts w:ascii="Consolas" w:hAnsi="Consolas"/>
+                <w:color w:val="1E293B"/>
+                <w:sz w:val="18"/>
+              </w:rPr>
+              <w:t>║      [ Number ] + [ Number ] = [ Sum ] to unlock the rudder!         ║</w:t>
+              <w:br/>
+            </w:r>
+            <w:r>
+              <w:rPr>
+                <w:rFonts w:ascii="Consolas" w:hAnsi="Consolas"/>
+                <w:color w:val="1E293B"/>
+                <w:sz w:val="18"/>
+              </w:rPr>
+              <w:t>║                                                                      ║</w:t>
+              <w:br/>
+            </w:r>
+            <w:r>
+              <w:rPr>
+                <w:rFonts w:ascii="Consolas" w:hAnsi="Consolas"/>
+                <w:color w:val="1E293B"/>
+                <w:sz w:val="18"/>
+              </w:rPr>
+              <w:t>║ 3. Sail the Lotus Raft Across the Rapids:                            ║</w:t>
+              <w:br/>
+            </w:r>
+            <w:r>
+              <w:rPr>
+                <w:rFonts w:ascii="Consolas" w:hAnsi="Consolas"/>
+                <w:color w:val="1E293B"/>
+                <w:sz w:val="18"/>
+              </w:rPr>
+              <w:t>║    • Board the Lotus Raft to cruise across the turbulent rapids!     ║</w:t>
+              <w:br/>
+            </w:r>
+            <w:r>
+              <w:rPr>
+                <w:rFonts w:ascii="Consolas" w:hAnsi="Consolas"/>
+                <w:color w:val="1E293B"/>
+                <w:sz w:val="18"/>
+              </w:rPr>
+              <w:t>║                                                                      ║</w:t>
+              <w:br/>
+            </w:r>
+            <w:r>
+              <w:rPr>
+                <w:rFonts w:ascii="Consolas" w:hAnsi="Consolas"/>
+                <w:color w:val="1E293B"/>
+                <w:sz w:val="18"/>
+              </w:rPr>
+              <w:t>║ 4. Enter the Grand Exit Portal to complete Cognitive Quest!          ║</w:t>
+              <w:br/>
+            </w:r>
+            <w:r>
+              <w:rPr>
+                <w:rFonts w:ascii="Consolas" w:hAnsi="Consolas"/>
+                <w:color w:val="1E293B"/>
+                <w:sz w:val="18"/>
+              </w:rPr>
+              <w:t>╚══════════════════════════════════════════════════════════════════════╝</w:t>
+              <w:br/>
+            </w:r>
+          </w:p>
+        </w:tc>
+      </w:tr>
+    </w:tbl>
+    <w:p/>
+    <w:p>
+      <w:pPr>
+        <w:spacing w:before="120" w:after="120"/>
+      </w:pPr>
+    </w:p>
+    <w:p>
+      <w:pPr>
+        <w:pStyle w:val="Heading3"/>
+        <w:spacing w:before="160" w:after="40"/>
+      </w:pPr>
+      <w:r>
+        <w:rPr>
+          <w:rFonts w:ascii="Calibri" w:hAnsi="Calibri"/>
+          <w:b/>
+          <w:color w:val="4338CA"/>
+          <w:sz w:val="23"/>
+        </w:rPr>
+        <w:t>💬 Stations 1–6: The 6 Elemental Water Guardians</w:t>
+      </w:r>
+    </w:p>
+    <w:p>
+      <w:pPr>
+        <w:pStyle w:val="Heading4"/>
+        <w:spacing w:before="120" w:after="40"/>
+      </w:pPr>
+      <w:r>
+        <w:rPr>
+          <w:rFonts w:ascii="Calibri" w:hAnsi="Calibri"/>
+          <w:b/>
+          <w:color w:val="78350F"/>
+          <w:sz w:val="21"/>
+        </w:rPr>
+        <w:t>🌊 Station 1: Aqua Sprite Marina (Guardian of the Azure Fountain)</w:t>
+      </w:r>
+    </w:p>
+    <w:tbl>
+      <w:tblPr>
+        <w:tblW w:type="auto" w:w="0"/>
+        <w:jc w:val="center"/>
+        <w:tblLook w:firstColumn="1" w:firstRow="1" w:lastColumn="0" w:lastRow="0" w:noHBand="0" w:noVBand="1" w:val="04A0"/>
+      </w:tblPr>
+      <w:tblGrid>
+        <w:gridCol w:w="9936"/>
+      </w:tblGrid>
+      <w:tr>
+        <w:tc>
+          <w:tcPr>
+            <w:tcW w:type="dxa" w:w="9936"/>
+            <w:shd w:fill="FAFAFA"/>
+          </w:tcPr>
+          <w:p>
+            <w:pPr>
+              <w:spacing w:before="60" w:after="60"/>
+            </w:pPr>
+            <w:r>
+              <w:rPr>
+                <w:rFonts w:ascii="Consolas" w:hAnsi="Consolas"/>
+                <w:b/>
+                <w:color w:val="0E7490"/>
+                <w:sz w:val="18"/>
+              </w:rPr>
+              <w:t>[Proximity Trigger]:</w:t>
+              <w:br/>
+            </w:r>
+            <w:r>
+              <w:rPr>
+                <w:rFonts w:ascii="Consolas" w:hAnsi="Consolas"/>
+                <w:color w:val="1E293B"/>
+                <w:sz w:val="18"/>
+              </w:rPr>
+              <w:t>Aqua Sprite Marina:</w:t>
+              <w:br/>
+            </w:r>
+            <w:r>
+              <w:rPr>
+                <w:rFonts w:ascii="Consolas" w:hAnsi="Consolas"/>
+                <w:color w:val="1E293B"/>
+                <w:sz w:val="18"/>
+              </w:rPr>
+              <w:t>“Splash! Welcome, diver! I am Marina, guardian of the crystalline azure fountain. The water currents dance to the rhythm of numbers! Hold a Closed Fist to test your math flow!”</w:t>
+              <w:br/>
+            </w:r>
+            <w:r>
+              <w:rPr>
+                <w:rFonts w:ascii="Consolas" w:hAnsi="Consolas"/>
+                <w:color w:val="1E293B"/>
+                <w:sz w:val="18"/>
+              </w:rPr>
+              <w:br/>
+            </w:r>
+            <w:r>
+              <w:rPr>
+                <w:rFonts w:ascii="Consolas" w:hAnsi="Consolas"/>
+                <w:b/>
+                <w:color w:val="0E7490"/>
+                <w:sz w:val="18"/>
+              </w:rPr>
+              <w:t>[Gesture: Fist Closed]:</w:t>
+              <w:br/>
+            </w:r>
+            <w:r>
+              <w:rPr>
+                <w:rFonts w:ascii="Consolas" w:hAnsi="Consolas"/>
+                <w:color w:val="1E293B"/>
+                <w:sz w:val="18"/>
+              </w:rPr>
+              <w:t>→ Pop up Dynamic Question from Database</w:t>
+              <w:br/>
+            </w:r>
+            <w:r>
+              <w:rPr>
+                <w:rFonts w:ascii="Consolas" w:hAnsi="Consolas"/>
+                <w:color w:val="1E293B"/>
+                <w:sz w:val="18"/>
+              </w:rPr>
+              <w:br/>
+            </w:r>
+            <w:r>
+              <w:rPr>
+                <w:rFonts w:ascii="Consolas" w:hAnsi="Consolas"/>
+                <w:b/>
+                <w:color w:val="0E7490"/>
+                <w:sz w:val="18"/>
+              </w:rPr>
+              <w:t>[Feedback - Wrong / Retry]:</w:t>
+              <w:br/>
+            </w:r>
+            <w:r>
+              <w:rPr>
+                <w:rFonts w:ascii="Consolas" w:hAnsi="Consolas"/>
+                <w:color w:val="1E293B"/>
+                <w:sz w:val="18"/>
+              </w:rPr>
+              <w:t>Aqua Sprite Marina:</w:t>
+              <w:br/>
+            </w:r>
+            <w:r>
+              <w:rPr>
+                <w:rFonts w:ascii="Consolas" w:hAnsi="Consolas"/>
+                <w:color w:val="1E293B"/>
+                <w:sz w:val="18"/>
+              </w:rPr>
+              <w:t>“Hmm, that is not quite correct. You have 1 try remaining! Think carefully.”</w:t>
+              <w:br/>
+            </w:r>
+            <w:r>
+              <w:rPr>
+                <w:rFonts w:ascii="Consolas" w:hAnsi="Consolas"/>
+                <w:color w:val="1E293B"/>
+                <w:sz w:val="18"/>
+              </w:rPr>
+              <w:br/>
+            </w:r>
+            <w:r>
+              <w:rPr>
+                <w:rFonts w:ascii="Consolas" w:hAnsi="Consolas"/>
+                <w:b/>
+                <w:color w:val="0E7490"/>
+                <w:sz w:val="18"/>
+              </w:rPr>
+              <w:t>[Feedback - Out of Tries]:</w:t>
+              <w:br/>
+            </w:r>
+            <w:r>
+              <w:rPr>
+                <w:rFonts w:ascii="Consolas" w:hAnsi="Consolas"/>
+                <w:color w:val="1E293B"/>
+                <w:sz w:val="18"/>
+              </w:rPr>
+              <w:t>Aqua Sprite Marina:</w:t>
+              <w:br/>
+            </w:r>
+            <w:r>
+              <w:rPr>
+                <w:rFonts w:ascii="Consolas" w:hAnsi="Consolas"/>
+                <w:color w:val="1E293B"/>
+                <w:sz w:val="18"/>
+              </w:rPr>
+              <w:t>“Out of tries! The correct answer was displayed above. Keep going—the water fountain still opened for you!”</w:t>
+              <w:br/>
+            </w:r>
+            <w:r>
+              <w:rPr>
+                <w:rFonts w:ascii="Consolas" w:hAnsi="Consolas"/>
+                <w:color w:val="1E293B"/>
+                <w:sz w:val="18"/>
+              </w:rPr>
+              <w:br/>
+            </w:r>
+            <w:r>
+              <w:rPr>
+                <w:rFonts w:ascii="Consolas" w:hAnsi="Consolas"/>
+                <w:b/>
+                <w:color w:val="0E7490"/>
+                <w:sz w:val="18"/>
+              </w:rPr>
+              <w:t>[Feedback - Correct]:</w:t>
+              <w:br/>
+            </w:r>
+            <w:r>
+              <w:rPr>
+                <w:rFonts w:ascii="Consolas" w:hAnsi="Consolas"/>
+                <w:color w:val="1E293B"/>
+                <w:sz w:val="18"/>
+              </w:rPr>
+              <w:t>Aqua Sprite Marina:</w:t>
+              <w:br/>
+            </w:r>
+            <w:r>
+              <w:rPr>
+                <w:rFonts w:ascii="Consolas" w:hAnsi="Consolas"/>
+                <w:color w:val="1E293B"/>
+                <w:sz w:val="18"/>
+              </w:rPr>
+              <w:t>“Splendid! Your mathematical intellect is top-tier! The fountain shines bright!”</w:t>
+              <w:br/>
+            </w:r>
+            <w:r>
+              <w:rPr>
+                <w:rFonts w:ascii="Consolas" w:hAnsi="Consolas"/>
+                <w:color w:val="1E293B"/>
+                <w:sz w:val="18"/>
+              </w:rPr>
+              <w:t>*(Golden Key / Sluice Emblem flies smoothly down to the Objectives HUD!)*</w:t>
+              <w:br/>
+            </w:r>
+          </w:p>
+        </w:tc>
+      </w:tr>
+    </w:tbl>
+    <w:p/>
+    <w:p>
+      <w:pPr>
+        <w:pStyle w:val="Heading4"/>
+        <w:spacing w:before="120" w:after="40"/>
+      </w:pPr>
+      <w:r>
+        <w:rPr>
+          <w:rFonts w:ascii="Calibri" w:hAnsi="Calibri"/>
+          <w:b/>
+          <w:color w:val="78350F"/>
+          <w:sz w:val="21"/>
+        </w:rPr>
+        <w:t>🪸 Station 2: Coral Sage Sheldon (Elder of the Geyser Basin)</w:t>
+      </w:r>
+    </w:p>
+    <w:tbl>
+      <w:tblPr>
+        <w:tblW w:type="auto" w:w="0"/>
+        <w:jc w:val="center"/>
+        <w:tblLook w:firstColumn="1" w:firstRow="1" w:lastColumn="0" w:lastRow="0" w:noHBand="0" w:noVBand="1" w:val="04A0"/>
+      </w:tblPr>
+      <w:tblGrid>
+        <w:gridCol w:w="9936"/>
+      </w:tblGrid>
+      <w:tr>
+        <w:tc>
+          <w:tcPr>
+            <w:tcW w:type="dxa" w:w="9936"/>
+            <w:shd w:fill="FAFAFA"/>
+          </w:tcPr>
+          <w:p>
+            <w:pPr>
+              <w:spacing w:before="60" w:after="60"/>
+            </w:pPr>
+            <w:r>
+              <w:rPr>
+                <w:rFonts w:ascii="Consolas" w:hAnsi="Consolas"/>
+                <w:b/>
+                <w:color w:val="0E7490"/>
+                <w:sz w:val="18"/>
+              </w:rPr>
+              <w:t>[Proximity Trigger]:</w:t>
+              <w:br/>
+            </w:r>
+            <w:r>
+              <w:rPr>
+                <w:rFonts w:ascii="Consolas" w:hAnsi="Consolas"/>
+                <w:color w:val="1E293B"/>
+                <w:sz w:val="18"/>
+              </w:rPr>
+              <w:t>Coral Sage Sheldon:</w:t>
+              <w:br/>
+            </w:r>
+            <w:r>
+              <w:rPr>
+                <w:rFonts w:ascii="Consolas" w:hAnsi="Consolas"/>
+                <w:color w:val="1E293B"/>
+                <w:sz w:val="18"/>
+              </w:rPr>
+              <w:t>“Greetings, patient student. I am Sheldon, keeper of the deep coral reefs. True understanding grows steadily, branch by branch. Hold a Closed Fist to consult the coral tablets!”</w:t>
+              <w:br/>
+            </w:r>
+            <w:r>
+              <w:rPr>
+                <w:rFonts w:ascii="Consolas" w:hAnsi="Consolas"/>
+                <w:color w:val="1E293B"/>
+                <w:sz w:val="18"/>
+              </w:rPr>
+              <w:br/>
+            </w:r>
+            <w:r>
+              <w:rPr>
+                <w:rFonts w:ascii="Consolas" w:hAnsi="Consolas"/>
+                <w:b/>
+                <w:color w:val="0E7490"/>
+                <w:sz w:val="18"/>
+              </w:rPr>
+              <w:t>[Gesture: Fist Closed]:</w:t>
+              <w:br/>
+            </w:r>
+            <w:r>
+              <w:rPr>
+                <w:rFonts w:ascii="Consolas" w:hAnsi="Consolas"/>
+                <w:color w:val="1E293B"/>
+                <w:sz w:val="18"/>
+              </w:rPr>
+              <w:t>→ Pop up Dynamic Question from Database</w:t>
+              <w:br/>
+            </w:r>
+            <w:r>
+              <w:rPr>
+                <w:rFonts w:ascii="Consolas" w:hAnsi="Consolas"/>
+                <w:color w:val="1E293B"/>
+                <w:sz w:val="18"/>
+              </w:rPr>
+              <w:br/>
+            </w:r>
+            <w:r>
+              <w:rPr>
+                <w:rFonts w:ascii="Consolas" w:hAnsi="Consolas"/>
+                <w:b/>
+                <w:color w:val="0E7490"/>
+                <w:sz w:val="18"/>
+              </w:rPr>
+              <w:t>[Feedback - Wrong / Retry]:</w:t>
+              <w:br/>
+            </w:r>
+            <w:r>
+              <w:rPr>
+                <w:rFonts w:ascii="Consolas" w:hAnsi="Consolas"/>
+                <w:color w:val="1E293B"/>
+                <w:sz w:val="18"/>
+              </w:rPr>
+              <w:t>Coral Sage Sheldon:</w:t>
+              <w:br/>
+            </w:r>
+            <w:r>
+              <w:rPr>
+                <w:rFonts w:ascii="Consolas" w:hAnsi="Consolas"/>
+                <w:color w:val="1E293B"/>
+                <w:sz w:val="18"/>
+              </w:rPr>
+              <w:t>“Hmm, that is not quite correct. You have 1 try remaining! Think carefully.”</w:t>
+              <w:br/>
+            </w:r>
+            <w:r>
+              <w:rPr>
+                <w:rFonts w:ascii="Consolas" w:hAnsi="Consolas"/>
+                <w:color w:val="1E293B"/>
+                <w:sz w:val="18"/>
+              </w:rPr>
+              <w:br/>
+            </w:r>
+            <w:r>
+              <w:rPr>
+                <w:rFonts w:ascii="Consolas" w:hAnsi="Consolas"/>
+                <w:b/>
+                <w:color w:val="0E7490"/>
+                <w:sz w:val="18"/>
+              </w:rPr>
+              <w:t>[Feedback - Out of Tries]:</w:t>
+              <w:br/>
+            </w:r>
+            <w:r>
+              <w:rPr>
+                <w:rFonts w:ascii="Consolas" w:hAnsi="Consolas"/>
+                <w:color w:val="1E293B"/>
+                <w:sz w:val="18"/>
+              </w:rPr>
+              <w:t>Coral Sage Sheldon:</w:t>
+              <w:br/>
+            </w:r>
+            <w:r>
+              <w:rPr>
+                <w:rFonts w:ascii="Consolas" w:hAnsi="Consolas"/>
+                <w:color w:val="1E293B"/>
+                <w:sz w:val="18"/>
+              </w:rPr>
+              <w:t>“Out of tries! The correct answer was displayed above. Coral wisdom rewards persistence—take this key and continue onward!”</w:t>
+              <w:br/>
+            </w:r>
+            <w:r>
+              <w:rPr>
+                <w:rFonts w:ascii="Consolas" w:hAnsi="Consolas"/>
+                <w:color w:val="1E293B"/>
+                <w:sz w:val="18"/>
+              </w:rPr>
+              <w:br/>
+            </w:r>
+            <w:r>
+              <w:rPr>
+                <w:rFonts w:ascii="Consolas" w:hAnsi="Consolas"/>
+                <w:b/>
+                <w:color w:val="0E7490"/>
+                <w:sz w:val="18"/>
+              </w:rPr>
+              <w:t>[Feedback - Correct]:</w:t>
+              <w:br/>
+            </w:r>
+            <w:r>
+              <w:rPr>
+                <w:rFonts w:ascii="Consolas" w:hAnsi="Consolas"/>
+                <w:color w:val="1E293B"/>
+                <w:sz w:val="18"/>
+              </w:rPr>
+              <w:t>Coral Sage Sheldon:</w:t>
+              <w:br/>
+            </w:r>
+            <w:r>
+              <w:rPr>
+                <w:rFonts w:ascii="Consolas" w:hAnsi="Consolas"/>
+                <w:color w:val="1E293B"/>
+                <w:sz w:val="18"/>
+              </w:rPr>
+              <w:t>“Excellent! That's correct, onto the next challenge! The geyser basin pulses with energy!”</w:t>
+              <w:br/>
+            </w:r>
+            <w:r>
+              <w:rPr>
+                <w:rFonts w:ascii="Consolas" w:hAnsi="Consolas"/>
+                <w:color w:val="1E293B"/>
+                <w:sz w:val="18"/>
+              </w:rPr>
+              <w:t>*(Golden Key / Sluice Emblem flies smoothly down to the Objectives HUD!)*</w:t>
+              <w:br/>
+            </w:r>
+          </w:p>
+        </w:tc>
+      </w:tr>
+    </w:tbl>
+    <w:p/>
+    <w:p>
+      <w:pPr>
+        <w:pStyle w:val="Heading4"/>
+        <w:spacing w:before="120" w:after="40"/>
+      </w:pPr>
+      <w:r>
+        <w:rPr>
+          <w:rFonts w:ascii="Calibri" w:hAnsi="Calibri"/>
+          <w:b/>
+          <w:color w:val="78350F"/>
+          <w:sz w:val="21"/>
+        </w:rPr>
+        <w:t>🛡️ Station 3: Tide Knight Finneas (Champion of the Torrent Gate)</w:t>
+      </w:r>
+    </w:p>
+    <w:tbl>
+      <w:tblPr>
+        <w:tblW w:type="auto" w:w="0"/>
+        <w:jc w:val="center"/>
+        <w:tblLook w:firstColumn="1" w:firstRow="1" w:lastColumn="0" w:lastRow="0" w:noHBand="0" w:noVBand="1" w:val="04A0"/>
+      </w:tblPr>
+      <w:tblGrid>
+        <w:gridCol w:w="9936"/>
+      </w:tblGrid>
+      <w:tr>
+        <w:tc>
+          <w:tcPr>
+            <w:tcW w:type="dxa" w:w="9936"/>
+            <w:shd w:fill="FAFAFA"/>
+          </w:tcPr>
+          <w:p>
+            <w:pPr>
+              <w:spacing w:before="60" w:after="60"/>
+            </w:pPr>
+            <w:r>
+              <w:rPr>
+                <w:rFonts w:ascii="Consolas" w:hAnsi="Consolas"/>
+                <w:b/>
+                <w:color w:val="0E7490"/>
+                <w:sz w:val="18"/>
+              </w:rPr>
+              <w:t>[Proximity Trigger]:</w:t>
+              <w:br/>
+            </w:r>
+            <w:r>
+              <w:rPr>
+                <w:rFonts w:ascii="Consolas" w:hAnsi="Consolas"/>
+                <w:color w:val="1E293B"/>
+                <w:sz w:val="18"/>
+              </w:rPr>
+              <w:t>Tide Knight Finneas:</w:t>
+              <w:br/>
+            </w:r>
+            <w:r>
+              <w:rPr>
+                <w:rFonts w:ascii="Consolas" w:hAnsi="Consolas"/>
+                <w:color w:val="1E293B"/>
+                <w:sz w:val="18"/>
+              </w:rPr>
+              <w:t>“Halt, young warrior! I am Finneas, champion of the torrent gate. Sharp logic is stronger than any trident! Are your counting skills ready? Hold a Closed Fist to begin the trial!”</w:t>
+              <w:br/>
+            </w:r>
+            <w:r>
+              <w:rPr>
+                <w:rFonts w:ascii="Consolas" w:hAnsi="Consolas"/>
+                <w:color w:val="1E293B"/>
+                <w:sz w:val="18"/>
+              </w:rPr>
+              <w:br/>
+            </w:r>
+            <w:r>
+              <w:rPr>
+                <w:rFonts w:ascii="Consolas" w:hAnsi="Consolas"/>
+                <w:b/>
+                <w:color w:val="0E7490"/>
+                <w:sz w:val="18"/>
+              </w:rPr>
+              <w:t>[Gesture: Fist Closed]:</w:t>
+              <w:br/>
+            </w:r>
+            <w:r>
+              <w:rPr>
+                <w:rFonts w:ascii="Consolas" w:hAnsi="Consolas"/>
+                <w:color w:val="1E293B"/>
+                <w:sz w:val="18"/>
+              </w:rPr>
+              <w:t>→ Pop up Dynamic Question from Database</w:t>
+              <w:br/>
+            </w:r>
+            <w:r>
+              <w:rPr>
+                <w:rFonts w:ascii="Consolas" w:hAnsi="Consolas"/>
+                <w:color w:val="1E293B"/>
+                <w:sz w:val="18"/>
+              </w:rPr>
+              <w:br/>
+            </w:r>
+            <w:r>
+              <w:rPr>
+                <w:rFonts w:ascii="Consolas" w:hAnsi="Consolas"/>
+                <w:b/>
+                <w:color w:val="0E7490"/>
+                <w:sz w:val="18"/>
+              </w:rPr>
+              <w:t>[Feedback - Wrong / Retry]:</w:t>
+              <w:br/>
+            </w:r>
+            <w:r>
+              <w:rPr>
+                <w:rFonts w:ascii="Consolas" w:hAnsi="Consolas"/>
+                <w:color w:val="1E293B"/>
+                <w:sz w:val="18"/>
+              </w:rPr>
+              <w:t>Tide Knight Finneas:</w:t>
+              <w:br/>
+            </w:r>
+            <w:r>
+              <w:rPr>
+                <w:rFonts w:ascii="Consolas" w:hAnsi="Consolas"/>
+                <w:color w:val="1E293B"/>
+                <w:sz w:val="18"/>
+              </w:rPr>
+              <w:t>“Hmm, that is not quite correct. You have 1 try remaining! Think carefully.”</w:t>
+              <w:br/>
+            </w:r>
+            <w:r>
+              <w:rPr>
+                <w:rFonts w:ascii="Consolas" w:hAnsi="Consolas"/>
+                <w:color w:val="1E293B"/>
+                <w:sz w:val="18"/>
+              </w:rPr>
+              <w:br/>
+            </w:r>
+            <w:r>
+              <w:rPr>
+                <w:rFonts w:ascii="Consolas" w:hAnsi="Consolas"/>
+                <w:b/>
+                <w:color w:val="0E7490"/>
+                <w:sz w:val="18"/>
+              </w:rPr>
+              <w:t>[Feedback - Out of Tries]:</w:t>
+              <w:br/>
+            </w:r>
+            <w:r>
+              <w:rPr>
+                <w:rFonts w:ascii="Consolas" w:hAnsi="Consolas"/>
+                <w:color w:val="1E293B"/>
+                <w:sz w:val="18"/>
+              </w:rPr>
+              <w:t>Tide Knight Finneas:</w:t>
+              <w:br/>
+            </w:r>
+            <w:r>
+              <w:rPr>
+                <w:rFonts w:ascii="Consolas" w:hAnsi="Consolas"/>
+                <w:color w:val="1E293B"/>
+                <w:sz w:val="18"/>
+              </w:rPr>
+              <w:t>“Out of tries! The correct answer was displayed above. Stand tall—a brave student learns from every trial! Take the gate key!”</w:t>
+              <w:br/>
+            </w:r>
+            <w:r>
+              <w:rPr>
+                <w:rFonts w:ascii="Consolas" w:hAnsi="Consolas"/>
+                <w:color w:val="1E293B"/>
+                <w:sz w:val="18"/>
+              </w:rPr>
+              <w:br/>
+            </w:r>
+            <w:r>
+              <w:rPr>
+                <w:rFonts w:ascii="Consolas" w:hAnsi="Consolas"/>
+                <w:b/>
+                <w:color w:val="0E7490"/>
+                <w:sz w:val="18"/>
+              </w:rPr>
+              <w:t>[Feedback - Correct]:</w:t>
+              <w:br/>
+            </w:r>
+            <w:r>
+              <w:rPr>
+                <w:rFonts w:ascii="Consolas" w:hAnsi="Consolas"/>
+                <w:color w:val="1E293B"/>
+                <w:sz w:val="18"/>
+              </w:rPr>
+              <w:t>Tide Knight Finneas:</w:t>
+              <w:br/>
+            </w:r>
+            <w:r>
+              <w:rPr>
+                <w:rFonts w:ascii="Consolas" w:hAnsi="Consolas"/>
+                <w:color w:val="1E293B"/>
+                <w:sz w:val="18"/>
+              </w:rPr>
+              <w:t>“Superb! Your logic is unbreakable, adventurer! The torrent gate opens wide!”</w:t>
+              <w:br/>
+            </w:r>
+            <w:r>
+              <w:rPr>
+                <w:rFonts w:ascii="Consolas" w:hAnsi="Consolas"/>
+                <w:color w:val="1E293B"/>
+                <w:sz w:val="18"/>
+              </w:rPr>
+              <w:t>*(Golden Key / Sluice Emblem flies smoothly down to the Objectives HUD!)*</w:t>
+              <w:br/>
+            </w:r>
+          </w:p>
+        </w:tc>
+      </w:tr>
+    </w:tbl>
+    <w:p/>
+    <w:p>
+      <w:pPr>
+        <w:pStyle w:val="Heading4"/>
+        <w:spacing w:before="120" w:after="40"/>
+      </w:pPr>
+      <w:r>
+        <w:rPr>
+          <w:rFonts w:ascii="Calibri" w:hAnsi="Calibri"/>
+          <w:b/>
+          <w:color w:val="78350F"/>
+          <w:sz w:val="21"/>
+        </w:rPr>
+        <w:t>🦎 Station 4: Axolotl Scholar Lani (Keeper of the Pearl Falls)</w:t>
+      </w:r>
+    </w:p>
+    <w:tbl>
+      <w:tblPr>
+        <w:tblW w:type="auto" w:w="0"/>
+        <w:jc w:val="center"/>
+        <w:tblLook w:firstColumn="1" w:firstRow="1" w:lastColumn="0" w:lastRow="0" w:noHBand="0" w:noVBand="1" w:val="04A0"/>
+      </w:tblPr>
+      <w:tblGrid>
+        <w:gridCol w:w="9936"/>
+      </w:tblGrid>
+      <w:tr>
+        <w:tc>
+          <w:tcPr>
+            <w:tcW w:type="dxa" w:w="9936"/>
+            <w:shd w:fill="FAFAFA"/>
+          </w:tcPr>
+          <w:p>
+            <w:pPr>
+              <w:spacing w:before="60" w:after="60"/>
+            </w:pPr>
+            <w:r>
+              <w:rPr>
+                <w:rFonts w:ascii="Consolas" w:hAnsi="Consolas"/>
+                <w:b/>
+                <w:color w:val="0E7490"/>
+                <w:sz w:val="18"/>
+              </w:rPr>
+              <w:t>[Proximity Trigger]:</w:t>
+              <w:br/>
+            </w:r>
+            <w:r>
+              <w:rPr>
+                <w:rFonts w:ascii="Consolas" w:hAnsi="Consolas"/>
+                <w:color w:val="1E293B"/>
+                <w:sz w:val="18"/>
+              </w:rPr>
+              <w:t>Axolotl Scholar Lani:</w:t>
+              <w:br/>
+            </w:r>
+            <w:r>
+              <w:rPr>
+                <w:rFonts w:ascii="Consolas" w:hAnsi="Consolas"/>
+                <w:color w:val="1E293B"/>
+                <w:sz w:val="18"/>
+              </w:rPr>
+              <w:t>“Bloop! Hello there! I am Lani, scholar of the pearl waterfalls. I love discovering patterns in the ripples! Hold a Closed Fist to see what math mystery we can solve together!”</w:t>
+              <w:br/>
+            </w:r>
+            <w:r>
+              <w:rPr>
+                <w:rFonts w:ascii="Consolas" w:hAnsi="Consolas"/>
+                <w:color w:val="1E293B"/>
+                <w:sz w:val="18"/>
+              </w:rPr>
+              <w:br/>
+            </w:r>
+            <w:r>
+              <w:rPr>
+                <w:rFonts w:ascii="Consolas" w:hAnsi="Consolas"/>
+                <w:b/>
+                <w:color w:val="0E7490"/>
+                <w:sz w:val="18"/>
+              </w:rPr>
+              <w:t>[Gesture: Fist Closed]:</w:t>
+              <w:br/>
+            </w:r>
+            <w:r>
+              <w:rPr>
+                <w:rFonts w:ascii="Consolas" w:hAnsi="Consolas"/>
+                <w:color w:val="1E293B"/>
+                <w:sz w:val="18"/>
+              </w:rPr>
+              <w:t>→ Pop up Dynamic Question from Database</w:t>
+              <w:br/>
+            </w:r>
+            <w:r>
+              <w:rPr>
+                <w:rFonts w:ascii="Consolas" w:hAnsi="Consolas"/>
+                <w:color w:val="1E293B"/>
+                <w:sz w:val="18"/>
+              </w:rPr>
+              <w:br/>
+            </w:r>
+            <w:r>
+              <w:rPr>
+                <w:rFonts w:ascii="Consolas" w:hAnsi="Consolas"/>
+                <w:b/>
+                <w:color w:val="0E7490"/>
+                <w:sz w:val="18"/>
+              </w:rPr>
+              <w:t>[Feedback - Wrong / Retry]:</w:t>
+              <w:br/>
+            </w:r>
+            <w:r>
+              <w:rPr>
+                <w:rFonts w:ascii="Consolas" w:hAnsi="Consolas"/>
+                <w:color w:val="1E293B"/>
+                <w:sz w:val="18"/>
+              </w:rPr>
+              <w:t>Axolotl Scholar Lani:</w:t>
+              <w:br/>
+            </w:r>
+            <w:r>
+              <w:rPr>
+                <w:rFonts w:ascii="Consolas" w:hAnsi="Consolas"/>
+                <w:color w:val="1E293B"/>
+                <w:sz w:val="18"/>
+              </w:rPr>
+              <w:t>“Hmm, that is not quite correct. You have 1 try remaining! Think carefully.”</w:t>
+              <w:br/>
+            </w:r>
+            <w:r>
+              <w:rPr>
+                <w:rFonts w:ascii="Consolas" w:hAnsi="Consolas"/>
+                <w:color w:val="1E293B"/>
+                <w:sz w:val="18"/>
+              </w:rPr>
+              <w:br/>
+            </w:r>
+            <w:r>
+              <w:rPr>
+                <w:rFonts w:ascii="Consolas" w:hAnsi="Consolas"/>
+                <w:b/>
+                <w:color w:val="0E7490"/>
+                <w:sz w:val="18"/>
+              </w:rPr>
+              <w:t>[Feedback - Out of Tries]:</w:t>
+              <w:br/>
+            </w:r>
+            <w:r>
+              <w:rPr>
+                <w:rFonts w:ascii="Consolas" w:hAnsi="Consolas"/>
+                <w:color w:val="1E293B"/>
+                <w:sz w:val="18"/>
+              </w:rPr>
+              <w:t>Axolotl Scholar Lani:</w:t>
+              <w:br/>
+            </w:r>
+            <w:r>
+              <w:rPr>
+                <w:rFonts w:ascii="Consolas" w:hAnsi="Consolas"/>
+                <w:color w:val="1E293B"/>
+                <w:sz w:val="18"/>
+              </w:rPr>
+              <w:t>“Out of tries! The correct answer was displayed above. Don't worry, friend—the pearl waterfall still reveals its treasure!”</w:t>
+              <w:br/>
+            </w:r>
+            <w:r>
+              <w:rPr>
+                <w:rFonts w:ascii="Consolas" w:hAnsi="Consolas"/>
+                <w:color w:val="1E293B"/>
+                <w:sz w:val="18"/>
+              </w:rPr>
+              <w:br/>
+            </w:r>
+            <w:r>
+              <w:rPr>
+                <w:rFonts w:ascii="Consolas" w:hAnsi="Consolas"/>
+                <w:b/>
+                <w:color w:val="0E7490"/>
+                <w:sz w:val="18"/>
+              </w:rPr>
+              <w:t>[Feedback - Correct]:</w:t>
+              <w:br/>
+            </w:r>
+            <w:r>
+              <w:rPr>
+                <w:rFonts w:ascii="Consolas" w:hAnsi="Consolas"/>
+                <w:color w:val="1E293B"/>
+                <w:sz w:val="18"/>
+              </w:rPr>
+              <w:t>Axolotl Scholar Lani:</w:t>
+              <w:br/>
+            </w:r>
+            <w:r>
+              <w:rPr>
+                <w:rFonts w:ascii="Consolas" w:hAnsi="Consolas"/>
+                <w:color w:val="1E293B"/>
+                <w:sz w:val="18"/>
+              </w:rPr>
+              <w:t>“Splendid! Your mathematical intellect is top-tier! The pearl falls shimmer with golden light!”</w:t>
+              <w:br/>
+            </w:r>
+            <w:r>
+              <w:rPr>
+                <w:rFonts w:ascii="Consolas" w:hAnsi="Consolas"/>
+                <w:color w:val="1E293B"/>
+                <w:sz w:val="18"/>
+              </w:rPr>
+              <w:t>*(Golden Key / Sluice Emblem flies smoothly down to the Objectives HUD!)*</w:t>
+              <w:br/>
+            </w:r>
+          </w:p>
+        </w:tc>
+      </w:tr>
+    </w:tbl>
+    <w:p/>
+    <w:p>
+      <w:pPr>
+        <w:pStyle w:val="Heading4"/>
+        <w:spacing w:before="120" w:after="40"/>
+      </w:pPr>
+      <w:r>
+        <w:rPr>
+          <w:rFonts w:ascii="Calibri" w:hAnsi="Calibri"/>
+          <w:b/>
+          <w:color w:val="78350F"/>
+          <w:sz w:val="21"/>
+        </w:rPr>
+        <w:t>🐉 Station 5: River Drake Coral (Sentinel of the Grand Aqueduct)</w:t>
+      </w:r>
+    </w:p>
+    <w:tbl>
+      <w:tblPr>
+        <w:tblW w:type="auto" w:w="0"/>
+        <w:jc w:val="center"/>
+        <w:tblLook w:firstColumn="1" w:firstRow="1" w:lastColumn="0" w:lastRow="0" w:noHBand="0" w:noVBand="1" w:val="04A0"/>
+      </w:tblPr>
+      <w:tblGrid>
+        <w:gridCol w:w="9936"/>
+      </w:tblGrid>
+      <w:tr>
+        <w:tc>
+          <w:tcPr>
+            <w:tcW w:type="dxa" w:w="9936"/>
+            <w:shd w:fill="FAFAFA"/>
+          </w:tcPr>
+          <w:p>
+            <w:pPr>
+              <w:spacing w:before="60" w:after="60"/>
+            </w:pPr>
+            <w:r>
+              <w:rPr>
+                <w:rFonts w:ascii="Consolas" w:hAnsi="Consolas"/>
+                <w:b/>
+                <w:color w:val="0E7490"/>
+                <w:sz w:val="18"/>
+              </w:rPr>
+              <w:t>[Proximity Trigger]:</w:t>
+              <w:br/>
+            </w:r>
+            <w:r>
+              <w:rPr>
+                <w:rFonts w:ascii="Consolas" w:hAnsi="Consolas"/>
+                <w:color w:val="1E293B"/>
+                <w:sz w:val="18"/>
+              </w:rPr>
+              <w:t>River Drake Coral:</w:t>
+              <w:br/>
+            </w:r>
+            <w:r>
+              <w:rPr>
+                <w:rFonts w:ascii="Consolas" w:hAnsi="Consolas"/>
+                <w:color w:val="1E293B"/>
+                <w:sz w:val="18"/>
+              </w:rPr>
+              <w:t>“Rumble! I am Coral the River Drake, sentinel of the grand aqueduct. Only sharp minds can navigate my aquatic channels. Hold a Closed Fist to show me your mathematical power!”</w:t>
+              <w:br/>
+            </w:r>
+            <w:r>
+              <w:rPr>
+                <w:rFonts w:ascii="Consolas" w:hAnsi="Consolas"/>
+                <w:color w:val="1E293B"/>
+                <w:sz w:val="18"/>
+              </w:rPr>
+              <w:br/>
+            </w:r>
+            <w:r>
+              <w:rPr>
+                <w:rFonts w:ascii="Consolas" w:hAnsi="Consolas"/>
+                <w:b/>
+                <w:color w:val="0E7490"/>
+                <w:sz w:val="18"/>
+              </w:rPr>
+              <w:t>[Gesture: Fist Closed]:</w:t>
+              <w:br/>
+            </w:r>
+            <w:r>
+              <w:rPr>
+                <w:rFonts w:ascii="Consolas" w:hAnsi="Consolas"/>
+                <w:color w:val="1E293B"/>
+                <w:sz w:val="18"/>
+              </w:rPr>
+              <w:t>→ Pop up Dynamic Question from Database</w:t>
+              <w:br/>
+            </w:r>
+            <w:r>
+              <w:rPr>
+                <w:rFonts w:ascii="Consolas" w:hAnsi="Consolas"/>
+                <w:color w:val="1E293B"/>
+                <w:sz w:val="18"/>
+              </w:rPr>
+              <w:br/>
+            </w:r>
+            <w:r>
+              <w:rPr>
+                <w:rFonts w:ascii="Consolas" w:hAnsi="Consolas"/>
+                <w:b/>
+                <w:color w:val="0E7490"/>
+                <w:sz w:val="18"/>
+              </w:rPr>
+              <w:t>[Feedback - Wrong / Retry]:</w:t>
+              <w:br/>
+            </w:r>
+            <w:r>
+              <w:rPr>
+                <w:rFonts w:ascii="Consolas" w:hAnsi="Consolas"/>
+                <w:color w:val="1E293B"/>
+                <w:sz w:val="18"/>
+              </w:rPr>
+              <w:t>River Drake Coral:</w:t>
+              <w:br/>
+            </w:r>
+            <w:r>
+              <w:rPr>
+                <w:rFonts w:ascii="Consolas" w:hAnsi="Consolas"/>
+                <w:color w:val="1E293B"/>
+                <w:sz w:val="18"/>
+              </w:rPr>
+              <w:t>“Hmm, that is not quite correct. You have 1 try remaining! Think carefully.”</w:t>
+              <w:br/>
+            </w:r>
+            <w:r>
+              <w:rPr>
+                <w:rFonts w:ascii="Consolas" w:hAnsi="Consolas"/>
+                <w:color w:val="1E293B"/>
+                <w:sz w:val="18"/>
+              </w:rPr>
+              <w:br/>
+            </w:r>
+            <w:r>
+              <w:rPr>
+                <w:rFonts w:ascii="Consolas" w:hAnsi="Consolas"/>
+                <w:b/>
+                <w:color w:val="0E7490"/>
+                <w:sz w:val="18"/>
+              </w:rPr>
+              <w:t>[Feedback - Out of Tries]:</w:t>
+              <w:br/>
+            </w:r>
+            <w:r>
+              <w:rPr>
+                <w:rFonts w:ascii="Consolas" w:hAnsi="Consolas"/>
+                <w:color w:val="1E293B"/>
+                <w:sz w:val="18"/>
+              </w:rPr>
+              <w:t>River Drake Coral:</w:t>
+              <w:br/>
+            </w:r>
+            <w:r>
+              <w:rPr>
+                <w:rFonts w:ascii="Consolas" w:hAnsi="Consolas"/>
+                <w:color w:val="1E293B"/>
+                <w:sz w:val="18"/>
+              </w:rPr>
+              <w:t>“Out of tries! The correct answer was displayed above. Your courage is recognized! Take this aqueduct key and swim forward!”</w:t>
+              <w:br/>
+            </w:r>
+            <w:r>
+              <w:rPr>
+                <w:rFonts w:ascii="Consolas" w:hAnsi="Consolas"/>
+                <w:color w:val="1E293B"/>
+                <w:sz w:val="18"/>
+              </w:rPr>
+              <w:br/>
+            </w:r>
+            <w:r>
+              <w:rPr>
+                <w:rFonts w:ascii="Consolas" w:hAnsi="Consolas"/>
+                <w:b/>
+                <w:color w:val="0E7490"/>
+                <w:sz w:val="18"/>
+              </w:rPr>
+              <w:t>[Feedback - Correct]:</w:t>
+              <w:br/>
+            </w:r>
+            <w:r>
+              <w:rPr>
+                <w:rFonts w:ascii="Consolas" w:hAnsi="Consolas"/>
+                <w:color w:val="1E293B"/>
+                <w:sz w:val="18"/>
+              </w:rPr>
+              <w:t>River Drake Coral:</w:t>
+              <w:br/>
+            </w:r>
+            <w:r>
+              <w:rPr>
+                <w:rFonts w:ascii="Consolas" w:hAnsi="Consolas"/>
+                <w:color w:val="1E293B"/>
+                <w:sz w:val="18"/>
+              </w:rPr>
+              <w:t>“Excellent! That's correct, onto the next challenge! The grand aqueduct flows without hindrance!”</w:t>
+              <w:br/>
+            </w:r>
+            <w:r>
+              <w:rPr>
+                <w:rFonts w:ascii="Consolas" w:hAnsi="Consolas"/>
+                <w:color w:val="1E293B"/>
+                <w:sz w:val="18"/>
+              </w:rPr>
+              <w:t>*(Golden Key / Sluice Emblem flies smoothly down to the Objectives HUD!)*</w:t>
+              <w:br/>
+            </w:r>
+          </w:p>
+        </w:tc>
+      </w:tr>
+    </w:tbl>
+    <w:p/>
+    <w:p>
+      <w:pPr>
+        <w:pStyle w:val="Heading4"/>
+        <w:spacing w:before="120" w:after="40"/>
+      </w:pPr>
+      <w:r>
+        <w:rPr>
+          <w:rFonts w:ascii="Calibri" w:hAnsi="Calibri"/>
+          <w:b/>
+          <w:color w:val="78350F"/>
+          <w:sz w:val="21"/>
+        </w:rPr>
+        <w:t>🌀 Station 6: Whirlpool Elder Glaucus (Master of Oceanic Currents)</w:t>
+      </w:r>
+    </w:p>
+    <w:tbl>
+      <w:tblPr>
+        <w:tblW w:type="auto" w:w="0"/>
+        <w:jc w:val="center"/>
+        <w:tblLook w:firstColumn="1" w:firstRow="1" w:lastColumn="0" w:lastRow="0" w:noHBand="0" w:noVBand="1" w:val="04A0"/>
+      </w:tblPr>
+      <w:tblGrid>
+        <w:gridCol w:w="9936"/>
+      </w:tblGrid>
+      <w:tr>
+        <w:tc>
+          <w:tcPr>
+            <w:tcW w:type="dxa" w:w="9936"/>
+            <w:shd w:fill="FAFAFA"/>
+          </w:tcPr>
+          <w:p>
+            <w:pPr>
+              <w:spacing w:before="60" w:after="60"/>
+            </w:pPr>
+            <w:r>
+              <w:rPr>
+                <w:rFonts w:ascii="Consolas" w:hAnsi="Consolas"/>
+                <w:b/>
+                <w:color w:val="0E7490"/>
+                <w:sz w:val="18"/>
+              </w:rPr>
+              <w:t>[Proximity Trigger]:</w:t>
+              <w:br/>
+            </w:r>
+            <w:r>
+              <w:rPr>
+                <w:rFonts w:ascii="Consolas" w:hAnsi="Consolas"/>
+                <w:color w:val="1E293B"/>
+                <w:sz w:val="18"/>
+              </w:rPr>
+              <w:t>Whirlpool Elder Glaucus:</w:t>
+              <w:br/>
+            </w:r>
+            <w:r>
+              <w:rPr>
+                <w:rFonts w:ascii="Consolas" w:hAnsi="Consolas"/>
+                <w:color w:val="1E293B"/>
+                <w:sz w:val="18"/>
+              </w:rPr>
+              <w:t>“Welcome to the heart of the sanctum, master student. I am Glaucus, master of oceanic currents. You have reached the pinnacle of Quarter 4! Hold a Closed Fist for your final elemental test!”</w:t>
+              <w:br/>
+            </w:r>
+            <w:r>
+              <w:rPr>
+                <w:rFonts w:ascii="Consolas" w:hAnsi="Consolas"/>
+                <w:color w:val="1E293B"/>
+                <w:sz w:val="18"/>
+              </w:rPr>
+              <w:br/>
+            </w:r>
+            <w:r>
+              <w:rPr>
+                <w:rFonts w:ascii="Consolas" w:hAnsi="Consolas"/>
+                <w:b/>
+                <w:color w:val="0E7490"/>
+                <w:sz w:val="18"/>
+              </w:rPr>
+              <w:t>[Gesture: Fist Closed]:</w:t>
+              <w:br/>
+            </w:r>
+            <w:r>
+              <w:rPr>
+                <w:rFonts w:ascii="Consolas" w:hAnsi="Consolas"/>
+                <w:color w:val="1E293B"/>
+                <w:sz w:val="18"/>
+              </w:rPr>
+              <w:t>→ Pop up Dynamic Question from Database</w:t>
+              <w:br/>
+            </w:r>
+            <w:r>
+              <w:rPr>
+                <w:rFonts w:ascii="Consolas" w:hAnsi="Consolas"/>
+                <w:color w:val="1E293B"/>
+                <w:sz w:val="18"/>
+              </w:rPr>
+              <w:br/>
+            </w:r>
+            <w:r>
+              <w:rPr>
+                <w:rFonts w:ascii="Consolas" w:hAnsi="Consolas"/>
+                <w:b/>
+                <w:color w:val="0E7490"/>
+                <w:sz w:val="18"/>
+              </w:rPr>
+              <w:t>[Feedback - Wrong / Retry]:</w:t>
+              <w:br/>
+            </w:r>
+            <w:r>
+              <w:rPr>
+                <w:rFonts w:ascii="Consolas" w:hAnsi="Consolas"/>
+                <w:color w:val="1E293B"/>
+                <w:sz w:val="18"/>
+              </w:rPr>
+              <w:t>Whirlpool Elder Glaucus:</w:t>
+              <w:br/>
+            </w:r>
+            <w:r>
+              <w:rPr>
+                <w:rFonts w:ascii="Consolas" w:hAnsi="Consolas"/>
+                <w:color w:val="1E293B"/>
+                <w:sz w:val="18"/>
+              </w:rPr>
+              <w:t>“Hmm, that is not quite correct. You have 1 try remaining! Think carefully.”</w:t>
+              <w:br/>
+            </w:r>
+            <w:r>
+              <w:rPr>
+                <w:rFonts w:ascii="Consolas" w:hAnsi="Consolas"/>
+                <w:color w:val="1E293B"/>
+                <w:sz w:val="18"/>
+              </w:rPr>
+              <w:br/>
+            </w:r>
+            <w:r>
+              <w:rPr>
+                <w:rFonts w:ascii="Consolas" w:hAnsi="Consolas"/>
+                <w:b/>
+                <w:color w:val="0E7490"/>
+                <w:sz w:val="18"/>
+              </w:rPr>
+              <w:t>[Feedback - Out of Tries]:</w:t>
+              <w:br/>
+            </w:r>
+            <w:r>
+              <w:rPr>
+                <w:rFonts w:ascii="Consolas" w:hAnsi="Consolas"/>
+                <w:color w:val="1E293B"/>
+                <w:sz w:val="18"/>
+              </w:rPr>
+              <w:t>Whirlpool Elder Glaucus:</w:t>
+              <w:br/>
+            </w:r>
+            <w:r>
+              <w:rPr>
+                <w:rFonts w:ascii="Consolas" w:hAnsi="Consolas"/>
+                <w:color w:val="1E293B"/>
+                <w:sz w:val="18"/>
+              </w:rPr>
+              <w:t>“Out of tries! The correct answer was displayed above. The ocean embraces your whole journey! Take the final Golden Key!”</w:t>
+              <w:br/>
+            </w:r>
+            <w:r>
+              <w:rPr>
+                <w:rFonts w:ascii="Consolas" w:hAnsi="Consolas"/>
+                <w:color w:val="1E293B"/>
+                <w:sz w:val="18"/>
+              </w:rPr>
+              <w:br/>
+            </w:r>
+            <w:r>
+              <w:rPr>
+                <w:rFonts w:ascii="Consolas" w:hAnsi="Consolas"/>
+                <w:b/>
+                <w:color w:val="0E7490"/>
+                <w:sz w:val="18"/>
+              </w:rPr>
+              <w:t>[Feedback - Correct]:</w:t>
+              <w:br/>
+            </w:r>
+            <w:r>
+              <w:rPr>
+                <w:rFonts w:ascii="Consolas" w:hAnsi="Consolas"/>
+                <w:color w:val="1E293B"/>
+                <w:sz w:val="18"/>
+              </w:rPr>
+              <w:t>Whirlpool Elder Glaucus:</w:t>
+              <w:br/>
+            </w:r>
+            <w:r>
+              <w:rPr>
+                <w:rFonts w:ascii="Consolas" w:hAnsi="Consolas"/>
+                <w:color w:val="1E293B"/>
+                <w:sz w:val="18"/>
+              </w:rPr>
+              <w:t>“Superb! Your logic is unbreakable, adventurer! All 6 oceanic currents are in perfect balance!”</w:t>
+              <w:br/>
+            </w:r>
+            <w:r>
+              <w:rPr>
+                <w:rFonts w:ascii="Consolas" w:hAnsi="Consolas"/>
+                <w:color w:val="1E293B"/>
+                <w:sz w:val="18"/>
+              </w:rPr>
+              <w:t>*(Golden Key / Sluice Emblem flies smoothly down to the Objectives HUD!)*</w:t>
+              <w:br/>
+            </w:r>
+          </w:p>
+        </w:tc>
+      </w:tr>
+    </w:tbl>
+    <w:p/>
+    <w:p>
+      <w:pPr>
+        <w:spacing w:before="120" w:after="120"/>
+      </w:pPr>
+    </w:p>
+    <w:p>
+      <w:pPr>
+        <w:pStyle w:val="Heading3"/>
+        <w:spacing w:before="160" w:after="40"/>
+      </w:pPr>
+      <w:r>
+        <w:rPr>
+          <w:rFonts w:ascii="Calibri" w:hAnsi="Calibri"/>
+          <w:b/>
+          <w:color w:val="4338CA"/>
+          <w:sz w:val="23"/>
+        </w:rPr>
+        <w:t>🗝️ Guardian Bromen Dialogues (Map 10 &amp; 11: Ancient Lock Block)</w:t>
+      </w:r>
+    </w:p>
+    <w:tbl>
+      <w:tblPr>
+        <w:tblW w:type="auto" w:w="0"/>
+        <w:jc w:val="center"/>
+        <w:tblLook w:firstColumn="1" w:firstRow="1" w:lastColumn="0" w:lastRow="0" w:noHBand="0" w:noVBand="1" w:val="04A0"/>
+      </w:tblPr>
+      <w:tblGrid>
+        <w:gridCol w:w="9936"/>
+      </w:tblGrid>
+      <w:tr>
+        <w:tc>
+          <w:tcPr>
+            <w:tcW w:type="dxa" w:w="9936"/>
+            <w:shd w:fill="FAFAFA"/>
+          </w:tcPr>
+          <w:p>
+            <w:pPr>
+              <w:spacing w:before="60" w:after="60"/>
+            </w:pPr>
+            <w:r>
+              <w:rPr>
+                <w:rFonts w:ascii="Consolas" w:hAnsi="Consolas"/>
+                <w:color w:val="1E293B"/>
+                <w:sz w:val="18"/>
+              </w:rPr>
+              <w:t>[If Keys &lt; 6]:</w:t>
+              <w:br/>
+            </w:r>
+            <w:r>
+              <w:rPr>
+                <w:rFonts w:ascii="Consolas" w:hAnsi="Consolas"/>
+                <w:color w:val="1E293B"/>
+                <w:sz w:val="18"/>
+              </w:rPr>
+              <w:t>Guardian Bromen:</w:t>
+              <w:br/>
+            </w:r>
+            <w:r>
+              <w:rPr>
+                <w:rFonts w:ascii="Consolas" w:hAnsi="Consolas"/>
+                <w:color w:val="1E293B"/>
+                <w:sz w:val="18"/>
+              </w:rPr>
+              <w:t>“Halt, student! The double doors and portal are sealed.</w:t>
+              <w:br/>
+            </w:r>
+            <w:r>
+              <w:rPr>
+                <w:rFonts w:ascii="Consolas" w:hAnsi="Consolas"/>
+                <w:color w:val="1E293B"/>
+                <w:sz w:val="18"/>
+              </w:rPr>
+              <w:t>You must first collect all 6 Golden Keys from the guardians in this chamber. (Current: [X]/6 Keys)”</w:t>
+              <w:br/>
+            </w:r>
+            <w:r>
+              <w:rPr>
+                <w:rFonts w:ascii="Consolas" w:hAnsi="Consolas"/>
+                <w:color w:val="1E293B"/>
+                <w:sz w:val="18"/>
+              </w:rPr>
+              <w:t>[Button]: “I will go search for them”</w:t>
+              <w:br/>
+            </w:r>
+            <w:r>
+              <w:rPr>
+                <w:rFonts w:ascii="Consolas" w:hAnsi="Consolas"/>
+                <w:color w:val="1E293B"/>
+                <w:sz w:val="18"/>
+              </w:rPr>
+              <w:br/>
+            </w:r>
+            <w:r>
+              <w:rPr>
+                <w:rFonts w:ascii="Consolas" w:hAnsi="Consolas"/>
+                <w:color w:val="1E293B"/>
+                <w:sz w:val="18"/>
+              </w:rPr>
+              <w:t>[If Keys == 6]:</w:t>
+              <w:br/>
+            </w:r>
+            <w:r>
+              <w:rPr>
+                <w:rFonts w:ascii="Consolas" w:hAnsi="Consolas"/>
+                <w:color w:val="1E293B"/>
+                <w:sz w:val="18"/>
+              </w:rPr>
+              <w:t>Guardian Bromen:</w:t>
+              <w:br/>
+            </w:r>
+            <w:r>
+              <w:rPr>
+                <w:rFonts w:ascii="Consolas" w:hAnsi="Consolas"/>
+                <w:color w:val="1E293B"/>
+                <w:sz w:val="18"/>
+              </w:rPr>
+              <w:t>“Excellent! You have collected all 6 Golden Keys.</w:t>
+              <w:br/>
+            </w:r>
+            <w:r>
+              <w:rPr>
+                <w:rFonts w:ascii="Consolas" w:hAnsi="Consolas"/>
+                <w:color w:val="1E293B"/>
+                <w:sz w:val="18"/>
+              </w:rPr>
+              <w:t>To unlock the double doors, you must now insert and turn the keys into the 6 slots on the Ancient Lock Block.”</w:t>
+              <w:br/>
+            </w:r>
+            <w:r>
+              <w:rPr>
+                <w:rFonts w:ascii="Consolas" w:hAnsi="Consolas"/>
+                <w:color w:val="1E293B"/>
+                <w:sz w:val="18"/>
+              </w:rPr>
+              <w:t>[Button]: “Unlock the Ancient Box”</w:t>
+              <w:br/>
+            </w:r>
+            <w:r>
+              <w:rPr>
+                <w:rFonts w:ascii="Consolas" w:hAnsi="Consolas"/>
+                <w:color w:val="1E293B"/>
+                <w:sz w:val="18"/>
+              </w:rPr>
+              <w:br/>
+            </w:r>
+            <w:r>
+              <w:rPr>
+                <w:rFonts w:ascii="Consolas" w:hAnsi="Consolas"/>
+                <w:color w:val="1E293B"/>
+                <w:sz w:val="18"/>
+              </w:rPr>
+              <w:t>[After Solving Key Puzzle]:</w:t>
+              <w:br/>
+            </w:r>
+            <w:r>
+              <w:rPr>
+                <w:rFonts w:ascii="Consolas" w:hAnsi="Consolas"/>
+                <w:color w:val="1E293B"/>
+                <w:sz w:val="18"/>
+              </w:rPr>
+              <w:t>Guardian Bromen:</w:t>
+              <w:br/>
+            </w:r>
+            <w:r>
+              <w:rPr>
+                <w:rFonts w:ascii="Consolas" w:hAnsi="Consolas"/>
+                <w:color w:val="1E293B"/>
+                <w:sz w:val="18"/>
+              </w:rPr>
+              <w:t>“Outstanding work, student! The Ancient Lock Block has been solved.</w:t>
+              <w:br/>
+            </w:r>
+            <w:r>
+              <w:rPr>
+                <w:rFonts w:ascii="Consolas" w:hAnsi="Consolas"/>
+                <w:color w:val="1E293B"/>
+                <w:sz w:val="18"/>
+              </w:rPr>
+              <w:t>The heavy double doors have swung open!</w:t>
+              <w:br/>
+            </w:r>
+            <w:r>
+              <w:rPr>
+                <w:rFonts w:ascii="Consolas" w:hAnsi="Consolas"/>
+                <w:color w:val="1E293B"/>
+                <w:sz w:val="18"/>
+              </w:rPr>
+              <w:t>Proceed through the doorway and step into the portal to finish.”</w:t>
+              <w:br/>
+            </w:r>
+            <w:r>
+              <w:rPr>
+                <w:rFonts w:ascii="Consolas" w:hAnsi="Consolas"/>
+                <w:color w:val="1E293B"/>
+                <w:sz w:val="18"/>
+              </w:rPr>
+              <w:t>[Button]: “Pass Through Doors”</w:t>
+              <w:br/>
+            </w:r>
+          </w:p>
+        </w:tc>
+      </w:tr>
+    </w:tbl>
+    <w:p/>
+    <w:p>
+      <w:pPr>
+        <w:spacing w:before="120" w:after="120"/>
+      </w:pPr>
+    </w:p>
+    <w:p>
+      <w:pPr>
+        <w:pStyle w:val="Heading3"/>
+        <w:spacing w:before="160" w:after="40"/>
+      </w:pPr>
+      <w:r>
+        <w:rPr>
+          <w:rFonts w:ascii="Calibri" w:hAnsi="Calibri"/>
+          <w:b/>
+          <w:color w:val="4338CA"/>
+          <w:sz w:val="23"/>
+        </w:rPr>
+        <w:t>⛵ Guardian Bromen &amp; Lotus Raft Dialogues (Map 12: Rapids Cruise)</w:t>
+      </w:r>
+    </w:p>
+    <w:tbl>
+      <w:tblPr>
+        <w:tblW w:type="auto" w:w="0"/>
+        <w:jc w:val="center"/>
+        <w:tblLook w:firstColumn="1" w:firstRow="1" w:lastColumn="0" w:lastRow="0" w:noHBand="0" w:noVBand="1" w:val="04A0"/>
+      </w:tblPr>
+      <w:tblGrid>
+        <w:gridCol w:w="9936"/>
+      </w:tblGrid>
+      <w:tr>
+        <w:tc>
+          <w:tcPr>
+            <w:tcW w:type="dxa" w:w="9936"/>
+            <w:shd w:fill="FAFAFA"/>
+          </w:tcPr>
+          <w:p>
+            <w:pPr>
+              <w:spacing w:before="60" w:after="60"/>
+            </w:pPr>
+            <w:r>
+              <w:rPr>
+                <w:rFonts w:ascii="Consolas" w:hAnsi="Consolas"/>
+                <w:color w:val="1E293B"/>
+                <w:sz w:val="18"/>
+              </w:rPr>
+              <w:t>[If Sluices &lt; 6]:</w:t>
+              <w:br/>
+            </w:r>
+            <w:r>
+              <w:rPr>
+                <w:rFonts w:ascii="Consolas" w:hAnsi="Consolas"/>
+                <w:color w:val="1E293B"/>
+                <w:sz w:val="18"/>
+              </w:rPr>
+              <w:t>Guardian Bromen (Lotus Raft Guardian):</w:t>
+              <w:br/>
+            </w:r>
+            <w:r>
+              <w:rPr>
+                <w:rFonts w:ascii="Consolas" w:hAnsi="Consolas"/>
+                <w:color w:val="1E293B"/>
+                <w:sz w:val="18"/>
+              </w:rPr>
+              <w:t>“Halt, young voyager! The Lotus Raft is safely moored.</w:t>
+              <w:br/>
+            </w:r>
+            <w:r>
+              <w:rPr>
+                <w:rFonts w:ascii="Consolas" w:hAnsi="Consolas"/>
+                <w:color w:val="1E293B"/>
+                <w:sz w:val="18"/>
+              </w:rPr>
+              <w:t>The canal is not yet full enough to carry us across.</w:t>
+              <w:br/>
+            </w:r>
+            <w:r>
+              <w:rPr>
+                <w:rFonts w:ascii="Consolas" w:hAnsi="Consolas"/>
+                <w:color w:val="1E293B"/>
+                <w:sz w:val="18"/>
+              </w:rPr>
+              <w:t>Open all 6 Aqueduct Sluices in the temple chambers! ([X]/6 Sluices Opened)”</w:t>
+              <w:br/>
+            </w:r>
+            <w:r>
+              <w:rPr>
+                <w:rFonts w:ascii="Consolas" w:hAnsi="Consolas"/>
+                <w:color w:val="1E293B"/>
+                <w:sz w:val="18"/>
+              </w:rPr>
+              <w:t>[Button]: “I will go open the sluices!”</w:t>
+              <w:br/>
+            </w:r>
+            <w:r>
+              <w:rPr>
+                <w:rFonts w:ascii="Consolas" w:hAnsi="Consolas"/>
+                <w:color w:val="1E293B"/>
+                <w:sz w:val="18"/>
+              </w:rPr>
+              <w:br/>
+            </w:r>
+            <w:r>
+              <w:rPr>
+                <w:rFonts w:ascii="Consolas" w:hAnsi="Consolas"/>
+                <w:color w:val="1E293B"/>
+                <w:sz w:val="18"/>
+              </w:rPr>
+              <w:t>[If Sluices == 6]:</w:t>
+              <w:br/>
+            </w:r>
+            <w:r>
+              <w:rPr>
+                <w:rFonts w:ascii="Consolas" w:hAnsi="Consolas"/>
+                <w:color w:val="1E293B"/>
+                <w:sz w:val="18"/>
+              </w:rPr>
+              <w:t>Guardian Bromen (Lotus Raft Guardian):</w:t>
+              <w:br/>
+            </w:r>
+            <w:r>
+              <w:rPr>
+                <w:rFonts w:ascii="Consolas" w:hAnsi="Consolas"/>
+                <w:color w:val="1E293B"/>
+                <w:sz w:val="18"/>
+              </w:rPr>
+              <w:t>“Marvelous! All 6 Aqueduct Sluices are open and the canal is full!</w:t>
+              <w:br/>
+            </w:r>
+            <w:r>
+              <w:rPr>
+                <w:rFonts w:ascii="Consolas" w:hAnsi="Consolas"/>
+                <w:color w:val="1E293B"/>
+                <w:sz w:val="18"/>
+              </w:rPr>
+              <w:t>Before we sail, the ancient rudder equation was scattered by the rapids!</w:t>
+              <w:br/>
+            </w:r>
+            <w:r>
+              <w:rPr>
+                <w:rFonts w:ascii="Consolas" w:hAnsi="Consolas"/>
+                <w:color w:val="1E293B"/>
+                <w:sz w:val="18"/>
+              </w:rPr>
+              <w:t>Arrange the scattered runes into a correct addition equation to unlock the helm!”</w:t>
+              <w:br/>
+            </w:r>
+            <w:r>
+              <w:rPr>
+                <w:rFonts w:ascii="Consolas" w:hAnsi="Consolas"/>
+                <w:color w:val="1E293B"/>
+                <w:sz w:val="18"/>
+              </w:rPr>
+              <w:t>[Button]: “Solve Addition Puzzle”</w:t>
+              <w:br/>
+            </w:r>
+            <w:r>
+              <w:rPr>
+                <w:rFonts w:ascii="Consolas" w:hAnsi="Consolas"/>
+                <w:color w:val="1E293B"/>
+                <w:sz w:val="18"/>
+              </w:rPr>
+              <w:br/>
+            </w:r>
+            <w:r>
+              <w:rPr>
+                <w:rFonts w:ascii="Consolas" w:hAnsi="Consolas"/>
+                <w:color w:val="1E293B"/>
+                <w:sz w:val="18"/>
+              </w:rPr>
+              <w:t>[After Solving Addition Altar]:</w:t>
+              <w:br/>
+            </w:r>
+            <w:r>
+              <w:rPr>
+                <w:rFonts w:ascii="Consolas" w:hAnsi="Consolas"/>
+                <w:color w:val="1E293B"/>
+                <w:sz w:val="18"/>
+              </w:rPr>
+              <w:t>Guardian Bromen (Lotus Raft Guardian):</w:t>
+              <w:br/>
+            </w:r>
+            <w:r>
+              <w:rPr>
+                <w:rFonts w:ascii="Consolas" w:hAnsi="Consolas"/>
+                <w:color w:val="1E293B"/>
+                <w:sz w:val="18"/>
+              </w:rPr>
+              <w:t>“Splendid addition, young voyager! The helm's rune equation is restored!</w:t>
+              <w:br/>
+            </w:r>
+            <w:r>
+              <w:rPr>
+                <w:rFonts w:ascii="Consolas" w:hAnsi="Consolas"/>
+                <w:color w:val="1E293B"/>
+                <w:sz w:val="18"/>
+              </w:rPr>
+              <w:t>The Lotus Raft is untethered and floating on the rapids!</w:t>
+              <w:br/>
+            </w:r>
+            <w:r>
+              <w:rPr>
+                <w:rFonts w:ascii="Consolas" w:hAnsi="Consolas"/>
+                <w:color w:val="1E293B"/>
+                <w:sz w:val="18"/>
+              </w:rPr>
+              <w:t>Walk onto the pier and hop aboard the raft to sail to the portal!”</w:t>
+              <w:br/>
+            </w:r>
+            <w:r>
+              <w:rPr>
+                <w:rFonts w:ascii="Consolas" w:hAnsi="Consolas"/>
+                <w:color w:val="1E293B"/>
+                <w:sz w:val="18"/>
+              </w:rPr>
+              <w:t>[Button]: “Step Aboard the Raft”</w:t>
               <w:br/>
             </w:r>
           </w:p>

</xml_diff>